<commit_message>
Deploying to gh-pages from @ Morrison-Lab/mcs@0a2bb8552866240c1a6c02d019809b9812e27ee2 🚀
</commit_message>
<xml_diff>
--- a/index.docx
+++ b/index.docx
@@ -15,7 +15,7 @@
         <w:pStyle w:val="Date"/>
       </w:pPr>
       <w:r>
-        <w:t xml:space="preserve">Last modified: 2026-10-22 15:24:07 (PDT)</w:t>
+        <w:t xml:space="preserve">Last modified: 2026-10-23 02:26:00 (PDT)</w:t>
       </w:r>
     </w:p>
     <w:bookmarkStart w:id="17" w:name="welcome"/>
@@ -55,7 +55,28 @@
         <w:t xml:space="preserve"> </w:t>
       </w:r>
       <w:r>
-        <w:t xml:space="preserve">site, and these notes link to it.</w:t>
+        <w:t xml:space="preserve">site.</w:t>
+      </w:r>
+      <w:r>
+        <w:t xml:space="preserve"> </w:t>
+      </w:r>
+      <w:r>
+        <w:t xml:space="preserve">These notes include its definitions, from the</w:t>
+      </w:r>
+      <w:r>
+        <w:t xml:space="preserve"> </w:t>
+      </w:r>
+      <w:r>
+        <w:rPr>
+          <w:rStyle w:val="VerbatimChar"/>
+        </w:rPr>
+        <w:t xml:space="preserve">mds</w:t>
+      </w:r>
+      <w:r>
+        <w:t xml:space="preserve"> </w:t>
+      </w:r>
+      <w:r>
+        <w:t xml:space="preserve">submodule, so each definition is written once and reads the same in both places.</w:t>
       </w:r>
     </w:p>
     <w:p>

</xml_diff>

<commit_message>
Deploying to gh-pages from @ Morrison-Lab/mcs@962037a97cf7c6fb825263eb6933c2608d4b47c1 🚀
</commit_message>
<xml_diff>
--- a/index.docx
+++ b/index.docx
@@ -15,10 +15,10 @@
         <w:pStyle w:val="Date"/>
       </w:pPr>
       <w:r>
-        <w:t xml:space="preserve">Last modified: 2026-10-23 02:26:00 (PDT)</w:t>
+        <w:t xml:space="preserve">Last modified: 2026-10-23 02:39:16 (PDT)</w:t>
       </w:r>
     </w:p>
-    <w:bookmarkStart w:id="17" w:name="welcome"/>
+    <w:bookmarkStart w:id="13" w:name="welcome"/>
     <w:p>
       <w:pPr>
         <w:pStyle w:val="Heading1"/>
@@ -208,151 +208,13 @@
         <w:t xml:space="preserve">extension</w:t>
       </w:r>
     </w:p>
-    <w:bookmarkStart w:id="12" w:name="about-this-website"/>
+    <w:bookmarkStart w:id="10" w:name="license"/>
     <w:p>
       <w:pPr>
         <w:pStyle w:val="Heading2"/>
       </w:pPr>
       <w:r>
-        <w:t xml:space="preserve">0.1 About this website</w:t>
-      </w:r>
-    </w:p>
-    <w:p>
-      <w:pPr>
-        <w:pStyle w:val="FirstParagraph"/>
-      </w:pPr>
-      <w:r>
-        <w:t xml:space="preserve">This website is built with</w:t>
-      </w:r>
-      <w:r>
-        <w:t xml:space="preserve"> </w:t>
-      </w:r>
-      <w:hyperlink r:id="rId10">
-        <w:r>
-          <w:rPr>
-            <w:rStyle w:val="Hyperlink"/>
-          </w:rPr>
-          <w:t xml:space="preserve">Quarto</w:t>
-        </w:r>
-      </w:hyperlink>
-      <w:r>
-        <w:t xml:space="preserve">, an open-source scientific and technical publishing system.</w:t>
-      </w:r>
-      <w:r>
-        <w:t xml:space="preserve"> </w:t>
-      </w:r>
-      <w:r>
-        <w:t xml:space="preserve">It was created from the</w:t>
-      </w:r>
-      <w:r>
-        <w:t xml:space="preserve"> </w:t>
-      </w:r>
-      <w:hyperlink r:id="rId11">
-        <w:r>
-          <w:rPr>
-            <w:rStyle w:val="Hyperlink"/>
-          </w:rPr>
-          <w:t xml:space="preserve">Morrison-Lab/qwt</w:t>
-        </w:r>
-      </w:hyperlink>
-      <w:r>
-        <w:t xml:space="preserve"> </w:t>
-      </w:r>
-      <w:r>
-        <w:t xml:space="preserve">template.</w:t>
-      </w:r>
-    </w:p>
-    <w:bookmarkEnd w:id="12"/>
-    <w:bookmarkStart w:id="13" w:name="building-the-website"/>
-    <w:p>
-      <w:pPr>
-        <w:pStyle w:val="Heading2"/>
-      </w:pPr>
-      <w:r>
-        <w:t xml:space="preserve">0.2 Building the website</w:t>
-      </w:r>
-    </w:p>
-    <w:p>
-      <w:pPr>
-        <w:pStyle w:val="FirstParagraph"/>
-      </w:pPr>
-      <w:r>
-        <w:t xml:space="preserve">To render the website locally:</w:t>
-      </w:r>
-    </w:p>
-    <w:p>
-      <w:pPr>
-        <w:pStyle w:val="SourceCode"/>
-      </w:pPr>
-      <w:r>
-        <w:rPr>
-          <w:rStyle w:val="ExtensionTok"/>
-        </w:rPr>
-        <w:t xml:space="preserve">quarto</w:t>
-      </w:r>
-      <w:r>
-        <w:rPr>
-          <w:rStyle w:val="NormalTok"/>
-        </w:rPr>
-        <w:t xml:space="preserve"> render</w:t>
-      </w:r>
-    </w:p>
-    <w:p>
-      <w:pPr>
-        <w:pStyle w:val="FirstParagraph"/>
-      </w:pPr>
-      <w:r>
-        <w:t xml:space="preserve">To preview the website with live reload:</w:t>
-      </w:r>
-    </w:p>
-    <w:p>
-      <w:pPr>
-        <w:pStyle w:val="SourceCode"/>
-      </w:pPr>
-      <w:r>
-        <w:rPr>
-          <w:rStyle w:val="ExtensionTok"/>
-        </w:rPr>
-        <w:t xml:space="preserve">quarto</w:t>
-      </w:r>
-      <w:r>
-        <w:rPr>
-          <w:rStyle w:val="NormalTok"/>
-        </w:rPr>
-        <w:t xml:space="preserve"> preview</w:t>
-      </w:r>
-    </w:p>
-    <w:p>
-      <w:pPr>
-        <w:pStyle w:val="FirstParagraph"/>
-      </w:pPr>
-      <w:r>
-        <w:t xml:space="preserve">The rendered output will be in the</w:t>
-      </w:r>
-      <w:r>
-        <w:t xml:space="preserve"> </w:t>
-      </w:r>
-      <w:r>
-        <w:rPr>
-          <w:rStyle w:val="VerbatimChar"/>
-        </w:rPr>
-        <w:t xml:space="preserve">_site/</w:t>
-      </w:r>
-      <w:r>
-        <w:t xml:space="preserve"> </w:t>
-      </w:r>
-      <w:r>
-        <w:t xml:space="preserve">directory, which GitHub Actions publishes to GitHub Pages.</w:t>
-      </w:r>
-    </w:p>
-    <w:bookmarkEnd w:id="13"/>
-    <w:bookmarkStart w:id="14" w:name="license"/>
-    <w:p>
-      <w:pPr>
-        <w:pStyle w:val="Heading2"/>
-      </w:pPr>
-      <w:r>
-        <w:t xml:space="preserve">0.3 License</w:t>
+        <w:t xml:space="preserve">0.1 License</w:t>
       </w:r>
     </w:p>
     <w:p>
@@ -378,8 +240,8 @@
         <w:t xml:space="preserve">file.</w:t>
       </w:r>
     </w:p>
-    <w:bookmarkEnd w:id="14"/>
-    <w:bookmarkStart w:id="16" w:name="references"/>
+    <w:bookmarkEnd w:id="10"/>
+    <w:bookmarkStart w:id="12" w:name="references"/>
     <w:p>
       <w:pPr>
         <w:pStyle w:val="Heading2"/>
@@ -388,10 +250,10 @@
         <w:t xml:space="preserve">References</w:t>
       </w:r>
     </w:p>
-    <w:bookmarkStart w:id="15" w:name="refs"/>
-    <w:bookmarkEnd w:id="15"/>
-    <w:bookmarkEnd w:id="16"/>
-    <w:bookmarkEnd w:id="17"/>
+    <w:bookmarkStart w:id="11" w:name="refs"/>
+    <w:bookmarkEnd w:id="11"/>
+    <w:bookmarkEnd w:id="12"/>
+    <w:bookmarkEnd w:id="13"/>
     <w:sectPr>
       <w:footnotePr>
         <w:numRestart w:val="eachSect"/>

</xml_diff>